<commit_message>
Meeting Log 2-23-26 through 3-1-26
</commit_message>
<xml_diff>
--- a/documentation/Meeting Logs/Meeting Log 2-23-26 through 3-1-26.docx
+++ b/documentation/Meeting Logs/Meeting Log 2-23-26 through 3-1-26.docx
@@ -538,6 +538,27 @@
                 <w:szCs w:val="22"/>
               </w:rPr>
             </w:pPr>
+            <w:r>
+              <w:rPr>
+                <w:sz w:val="22"/>
+                <w:szCs w:val="22"/>
+              </w:rPr>
+              <w:t>2/2</w:t>
+            </w:r>
+            <w:r>
+              <w:rPr>
+                <w:sz w:val="22"/>
+                <w:szCs w:val="22"/>
+              </w:rPr>
+              <w:t>5</w:t>
+            </w:r>
+            <w:r>
+              <w:rPr>
+                <w:sz w:val="22"/>
+                <w:szCs w:val="22"/>
+              </w:rPr>
+              <w:t>/26</w:t>
+            </w:r>
           </w:p>
         </w:tc>
         <w:tc>
@@ -551,6 +572,13 @@
                 <w:szCs w:val="22"/>
               </w:rPr>
             </w:pPr>
+            <w:r>
+              <w:rPr>
+                <w:sz w:val="22"/>
+                <w:szCs w:val="22"/>
+              </w:rPr>
+              <w:t>4:00 P.M.</w:t>
+            </w:r>
           </w:p>
         </w:tc>
         <w:tc>
@@ -564,6 +592,13 @@
                 <w:szCs w:val="22"/>
               </w:rPr>
             </w:pPr>
+            <w:r>
+              <w:rPr>
+                <w:sz w:val="22"/>
+                <w:szCs w:val="22"/>
+              </w:rPr>
+              <w:t>Eric Parral, Kyler Cressall, Thomas Ross, Nathan Carlson</w:t>
+            </w:r>
           </w:p>
         </w:tc>
       </w:tr>
@@ -613,6 +648,13 @@
                 <w:szCs w:val="22"/>
               </w:rPr>
             </w:pPr>
+            <w:r>
+              <w:rPr>
+                <w:sz w:val="22"/>
+                <w:szCs w:val="22"/>
+              </w:rPr>
+              <w:t>2/26/26</w:t>
+            </w:r>
           </w:p>
         </w:tc>
         <w:tc>
@@ -626,6 +668,27 @@
                 <w:szCs w:val="22"/>
               </w:rPr>
             </w:pPr>
+            <w:r>
+              <w:rPr>
+                <w:sz w:val="22"/>
+                <w:szCs w:val="22"/>
+              </w:rPr>
+              <w:t>7:00</w:t>
+            </w:r>
+            <w:r>
+              <w:rPr>
+                <w:sz w:val="22"/>
+                <w:szCs w:val="22"/>
+              </w:rPr>
+              <w:t>P.M</w:t>
+            </w:r>
+            <w:r>
+              <w:rPr>
+                <w:sz w:val="22"/>
+                <w:szCs w:val="22"/>
+              </w:rPr>
+              <w:t>.</w:t>
+            </w:r>
           </w:p>
         </w:tc>
         <w:tc>
@@ -639,6 +702,13 @@
                 <w:szCs w:val="22"/>
               </w:rPr>
             </w:pPr>
+            <w:r>
+              <w:rPr>
+                <w:sz w:val="22"/>
+                <w:szCs w:val="22"/>
+              </w:rPr>
+              <w:t>Eric Parral, Kyler Cressall, Thomas Ross, Nathan Carlson</w:t>
+            </w:r>
           </w:p>
         </w:tc>
       </w:tr>
@@ -762,6 +832,22 @@
         </w:rPr>
         <w:t>Meeting 2:</w:t>
       </w:r>
+      <w:r>
+        <w:rPr>
+          <w:sz w:val="22"/>
+          <w:szCs w:val="22"/>
+        </w:rPr>
+        <w:t xml:space="preserve"> We determined what tasks still needed to be </w:t>
+      </w:r>
+      <w:proofErr w:type="spellStart"/>
+      <w:r>
+        <w:rPr>
+          <w:sz w:val="22"/>
+          <w:szCs w:val="22"/>
+        </w:rPr>
+        <w:t>acomplished</w:t>
+      </w:r>
+      <w:proofErr w:type="spellEnd"/>
     </w:p>
     <w:p>
       <w:pPr>
@@ -776,6 +862,29 @@
           <w:szCs w:val="22"/>
         </w:rPr>
         <w:t>Meeting 3:</w:t>
+      </w:r>
+      <w:r>
+        <w:rPr>
+          <w:sz w:val="22"/>
+          <w:szCs w:val="22"/>
+        </w:rPr>
+        <w:t xml:space="preserve"> Researched other </w:t>
+      </w:r>
+      <w:proofErr w:type="spellStart"/>
+      <w:r>
+        <w:rPr>
+          <w:sz w:val="22"/>
+          <w:szCs w:val="22"/>
+        </w:rPr>
+        <w:t>apis</w:t>
+      </w:r>
+      <w:proofErr w:type="spellEnd"/>
+      <w:r>
+        <w:rPr>
+          <w:sz w:val="22"/>
+          <w:szCs w:val="22"/>
+        </w:rPr>
+        <w:t xml:space="preserve"> for the gas pricing and filtering. </w:t>
       </w:r>
     </w:p>
     <w:p>
@@ -847,6 +956,13 @@
         </w:rPr>
         <w:t>Meeting 2:</w:t>
       </w:r>
+      <w:r>
+        <w:rPr>
+          <w:sz w:val="22"/>
+          <w:szCs w:val="22"/>
+        </w:rPr>
+        <w:t xml:space="preserve"> Understanding what integration testing really means. </w:t>
+      </w:r>
     </w:p>
     <w:p>
       <w:pPr>
@@ -861,6 +977,36 @@
           <w:szCs w:val="22"/>
         </w:rPr>
         <w:t>Meeting 3:</w:t>
+      </w:r>
+      <w:r>
+        <w:rPr>
+          <w:sz w:val="22"/>
+          <w:szCs w:val="22"/>
+        </w:rPr>
+        <w:t xml:space="preserve"> </w:t>
+      </w:r>
+      <w:r>
+        <w:rPr>
+          <w:sz w:val="22"/>
+          <w:szCs w:val="22"/>
+        </w:rPr>
+        <w:t xml:space="preserve">None for this meeting </w:t>
+      </w:r>
+      <w:proofErr w:type="gramStart"/>
+      <w:r>
+        <w:rPr>
+          <w:sz w:val="22"/>
+          <w:szCs w:val="22"/>
+        </w:rPr>
+        <w:t>still</w:t>
+      </w:r>
+      <w:proofErr w:type="gramEnd"/>
+      <w:r>
+        <w:rPr>
+          <w:sz w:val="22"/>
+          <w:szCs w:val="22"/>
+        </w:rPr>
+        <w:t xml:space="preserve"> looking into integration testing. </w:t>
       </w:r>
     </w:p>
     <w:p>
@@ -930,23 +1076,44 @@
           <w:sz w:val="22"/>
           <w:szCs w:val="22"/>
         </w:rPr>
+        <w:lastRenderedPageBreak/>
         <w:t>Meeting 2:</w:t>
       </w:r>
-    </w:p>
-    <w:p>
-      <w:pPr>
-        <w:rPr>
-          <w:sz w:val="22"/>
-          <w:szCs w:val="22"/>
-        </w:rPr>
-      </w:pPr>
-      <w:r>
-        <w:rPr>
-          <w:sz w:val="22"/>
-          <w:szCs w:val="22"/>
-        </w:rPr>
-        <w:lastRenderedPageBreak/>
+      <w:r>
+        <w:rPr>
+          <w:sz w:val="22"/>
+          <w:szCs w:val="22"/>
+        </w:rPr>
+        <w:t xml:space="preserve"> Research gas pricing API and other features. f</w:t>
+      </w:r>
+    </w:p>
+    <w:p>
+      <w:pPr>
+        <w:rPr>
+          <w:sz w:val="22"/>
+          <w:szCs w:val="22"/>
+        </w:rPr>
+      </w:pPr>
+      <w:r>
+        <w:rPr>
+          <w:sz w:val="22"/>
+          <w:szCs w:val="22"/>
+        </w:rPr>
         <w:t>Meeting 3:</w:t>
+      </w:r>
+      <w:r>
+        <w:rPr>
+          <w:sz w:val="22"/>
+          <w:szCs w:val="22"/>
+        </w:rPr>
+        <w:t xml:space="preserve"> Testing plan and automated testing, Backlogs and </w:t>
+      </w:r>
+      <w:r>
+        <w:rPr>
+          <w:sz w:val="22"/>
+          <w:szCs w:val="22"/>
+        </w:rPr>
+        <w:t>customer feedback</w:t>
       </w:r>
     </w:p>
     <w:p>
@@ -1028,6 +1195,13 @@
         </w:rPr>
         <w:t>Meeting 2:</w:t>
       </w:r>
+      <w:r>
+        <w:rPr>
+          <w:sz w:val="22"/>
+          <w:szCs w:val="22"/>
+        </w:rPr>
+        <w:t xml:space="preserve"> None for this meeting.</w:t>
+      </w:r>
     </w:p>
     <w:p>
       <w:pPr>
@@ -1043,6 +1217,156 @@
         </w:rPr>
         <w:t>Meeting 3:</w:t>
       </w:r>
+      <w:r>
+        <w:rPr>
+          <w:sz w:val="22"/>
+          <w:szCs w:val="22"/>
+        </w:rPr>
+        <w:t xml:space="preserve"> </w:t>
+      </w:r>
+      <w:r>
+        <w:rPr>
+          <w:sz w:val="22"/>
+          <w:szCs w:val="22"/>
+        </w:rPr>
+        <w:t>New Sprint 2 Requirements:</w:t>
+      </w:r>
+      <w:r>
+        <w:rPr>
+          <w:sz w:val="22"/>
+          <w:szCs w:val="22"/>
+        </w:rPr>
+        <w:br/>
+        <w:t>- Refactoring </w:t>
+      </w:r>
+      <w:r>
+        <w:rPr>
+          <w:sz w:val="22"/>
+          <w:szCs w:val="22"/>
+        </w:rPr>
+        <w:br/>
+      </w:r>
+      <w:r>
+        <w:rPr>
+          <w:sz w:val="22"/>
+          <w:szCs w:val="22"/>
+        </w:rPr>
+        <w:t> </w:t>
+      </w:r>
+      <w:r>
+        <w:rPr>
+          <w:sz w:val="22"/>
+          <w:szCs w:val="22"/>
+        </w:rPr>
+        <w:t> </w:t>
+      </w:r>
+      <w:r>
+        <w:rPr>
+          <w:sz w:val="22"/>
+          <w:szCs w:val="22"/>
+        </w:rPr>
+        <w:t>- make backlog items of things we should change</w:t>
+      </w:r>
+      <w:r>
+        <w:rPr>
+          <w:sz w:val="22"/>
+          <w:szCs w:val="22"/>
+        </w:rPr>
+        <w:br/>
+      </w:r>
+      <w:r>
+        <w:rPr>
+          <w:sz w:val="22"/>
+          <w:szCs w:val="22"/>
+        </w:rPr>
+        <w:t> </w:t>
+      </w:r>
+      <w:r>
+        <w:rPr>
+          <w:sz w:val="22"/>
+          <w:szCs w:val="22"/>
+        </w:rPr>
+        <w:t> </w:t>
+      </w:r>
+      <w:r>
+        <w:rPr>
+          <w:sz w:val="22"/>
+          <w:szCs w:val="22"/>
+        </w:rPr>
+        <w:t>- make customer feedback to those items</w:t>
+      </w:r>
+      <w:r>
+        <w:rPr>
+          <w:sz w:val="22"/>
+          <w:szCs w:val="22"/>
+        </w:rPr>
+        <w:br/>
+        <w:t>- Integration Testing</w:t>
+      </w:r>
+      <w:r>
+        <w:rPr>
+          <w:sz w:val="22"/>
+          <w:szCs w:val="22"/>
+        </w:rPr>
+        <w:br/>
+      </w:r>
+      <w:r>
+        <w:rPr>
+          <w:sz w:val="22"/>
+          <w:szCs w:val="22"/>
+        </w:rPr>
+        <w:t> </w:t>
+      </w:r>
+      <w:r>
+        <w:rPr>
+          <w:sz w:val="22"/>
+          <w:szCs w:val="22"/>
+        </w:rPr>
+        <w:t> </w:t>
+      </w:r>
+      <w:r>
+        <w:rPr>
+          <w:sz w:val="22"/>
+          <w:szCs w:val="22"/>
+        </w:rPr>
+        <w:t>- start out automated testing for functional requirements </w:t>
+      </w:r>
+      <w:r>
+        <w:rPr>
+          <w:sz w:val="22"/>
+          <w:szCs w:val="22"/>
+        </w:rPr>
+        <w:br/>
+        <w:t>- Non-functional Testing</w:t>
+      </w:r>
+      <w:r>
+        <w:rPr>
+          <w:sz w:val="22"/>
+          <w:szCs w:val="22"/>
+        </w:rPr>
+        <w:br/>
+      </w:r>
+      <w:r>
+        <w:rPr>
+          <w:sz w:val="22"/>
+          <w:szCs w:val="22"/>
+        </w:rPr>
+        <w:t> </w:t>
+      </w:r>
+      <w:r>
+        <w:rPr>
+          <w:sz w:val="22"/>
+          <w:szCs w:val="22"/>
+        </w:rPr>
+        <w:t> </w:t>
+      </w:r>
+      <w:r>
+        <w:rPr>
+          <w:sz w:val="22"/>
+          <w:szCs w:val="22"/>
+        </w:rPr>
+        <w:t>- checklist to manually test non-functional requirements</w:t>
+      </w:r>
     </w:p>
     <w:p>
       <w:pPr>
@@ -1156,6 +1480,201 @@
           <w:szCs w:val="22"/>
         </w:rPr>
         <w:t>Database for an offline mode- Caching data- Kyler</w:t>
+      </w:r>
+    </w:p>
+    <w:p>
+      <w:pPr>
+        <w:rPr>
+          <w:b/>
+          <w:bCs/>
+          <w:sz w:val="22"/>
+          <w:szCs w:val="22"/>
+        </w:rPr>
+      </w:pPr>
+    </w:p>
+    <w:p>
+      <w:pPr>
+        <w:rPr>
+          <w:b/>
+          <w:bCs/>
+          <w:sz w:val="22"/>
+          <w:szCs w:val="22"/>
+        </w:rPr>
+      </w:pPr>
+      <w:r>
+        <w:rPr>
+          <w:b/>
+          <w:bCs/>
+          <w:sz w:val="22"/>
+          <w:szCs w:val="22"/>
+        </w:rPr>
+        <w:t xml:space="preserve">Testing </w:t>
+      </w:r>
+    </w:p>
+    <w:p>
+      <w:pPr>
+        <w:rPr>
+          <w:b/>
+          <w:bCs/>
+          <w:sz w:val="22"/>
+          <w:szCs w:val="22"/>
+        </w:rPr>
+      </w:pPr>
+      <w:r>
+        <w:rPr>
+          <w:b/>
+          <w:bCs/>
+          <w:sz w:val="22"/>
+          <w:szCs w:val="22"/>
+        </w:rPr>
+        <w:t xml:space="preserve">Manual Testing Non-Function maybe </w:t>
+      </w:r>
+      <w:r>
+        <w:rPr>
+          <w:b/>
+          <w:bCs/>
+          <w:sz w:val="22"/>
+          <w:szCs w:val="22"/>
+        </w:rPr>
+        <w:t>automate some</w:t>
+      </w:r>
+    </w:p>
+    <w:p>
+      <w:pPr>
+        <w:rPr>
+          <w:b/>
+          <w:bCs/>
+          <w:sz w:val="22"/>
+          <w:szCs w:val="22"/>
+        </w:rPr>
+      </w:pPr>
+      <w:r>
+        <w:rPr>
+          <w:b/>
+          <w:bCs/>
+          <w:sz w:val="22"/>
+          <w:szCs w:val="22"/>
+        </w:rPr>
+        <w:t>Integration Testing</w:t>
+      </w:r>
+      <w:r>
+        <w:rPr>
+          <w:b/>
+          <w:bCs/>
+          <w:sz w:val="22"/>
+          <w:szCs w:val="22"/>
+        </w:rPr>
+        <w:t>- Functional Testing and non-functional</w:t>
+      </w:r>
+    </w:p>
+    <w:p>
+      <w:pPr>
+        <w:rPr>
+          <w:b/>
+          <w:bCs/>
+          <w:sz w:val="22"/>
+          <w:szCs w:val="22"/>
+        </w:rPr>
+      </w:pPr>
+      <w:r>
+        <w:rPr>
+          <w:b/>
+          <w:bCs/>
+          <w:sz w:val="22"/>
+          <w:szCs w:val="22"/>
+        </w:rPr>
+        <w:t>Test Plan and testing – Eric</w:t>
+      </w:r>
+      <w:r>
+        <w:rPr>
+          <w:b/>
+          <w:bCs/>
+          <w:sz w:val="22"/>
+          <w:szCs w:val="22"/>
+        </w:rPr>
+        <w:t xml:space="preserve"> (Test Plan) Nathan (</w:t>
+      </w:r>
+      <w:r>
+        <w:rPr>
+          <w:b/>
+          <w:bCs/>
+          <w:sz w:val="22"/>
+          <w:szCs w:val="22"/>
+        </w:rPr>
+        <w:t>Functional)</w:t>
+      </w:r>
+      <w:r>
+        <w:rPr>
+          <w:b/>
+          <w:bCs/>
+          <w:sz w:val="22"/>
+          <w:szCs w:val="22"/>
+        </w:rPr>
+        <w:t xml:space="preserve"> </w:t>
+      </w:r>
+      <w:r>
+        <w:rPr>
+          <w:b/>
+          <w:bCs/>
+          <w:sz w:val="22"/>
+          <w:szCs w:val="22"/>
+        </w:rPr>
+        <w:t>Thomas (</w:t>
+      </w:r>
+      <w:r>
+        <w:rPr>
+          <w:b/>
+          <w:bCs/>
+          <w:sz w:val="22"/>
+          <w:szCs w:val="22"/>
+        </w:rPr>
+        <w:t xml:space="preserve">Non-Functional) </w:t>
+      </w:r>
+    </w:p>
+    <w:p>
+      <w:pPr>
+        <w:rPr>
+          <w:b/>
+          <w:bCs/>
+          <w:sz w:val="22"/>
+          <w:szCs w:val="22"/>
+        </w:rPr>
+      </w:pPr>
+      <w:r>
+        <w:rPr>
+          <w:b/>
+          <w:bCs/>
+          <w:sz w:val="22"/>
+          <w:szCs w:val="22"/>
+        </w:rPr>
+        <w:t xml:space="preserve">Customer feedback </w:t>
+      </w:r>
+      <w:r>
+        <w:rPr>
+          <w:b/>
+          <w:bCs/>
+          <w:sz w:val="22"/>
+          <w:szCs w:val="22"/>
+        </w:rPr>
+        <w:t xml:space="preserve">&amp; </w:t>
+      </w:r>
+      <w:r>
+        <w:rPr>
+          <w:b/>
+          <w:bCs/>
+          <w:sz w:val="22"/>
+          <w:szCs w:val="22"/>
+        </w:rPr>
+        <w:t>Backlog Documentation</w:t>
+      </w:r>
+      <w:r>
+        <w:rPr>
+          <w:b/>
+          <w:bCs/>
+          <w:sz w:val="22"/>
+          <w:szCs w:val="22"/>
+        </w:rPr>
+        <w:t xml:space="preserve">- Kyler </w:t>
       </w:r>
     </w:p>
     <w:p>
@@ -1305,6 +1824,7 @@
           <w:sz w:val="22"/>
           <w:szCs w:val="22"/>
         </w:rPr>
+        <w:lastRenderedPageBreak/>
         <w:t xml:space="preserve">Extended to 2/28/26 due to midterms happening this week. </w:t>
       </w:r>
     </w:p>

</xml_diff>